<commit_message>
feat: enhance job search functionality with improved salary formatting and API integration
</commit_message>
<xml_diff>
--- a/Jason_Darrow_Resume.docx
+++ b/Jason_Darrow_Resume.docx
@@ -131,7 +131,7 @@
           <w:i w:val="0"/>
           <w:sz w:val="21"/>
         </w:rPr>
-        <w:t>Progressive IT Leader with 15+ years of experience managing cross-functional delivery teams and strategic programs ranging from $250K to $3M in Financial Services environments. Proven track record of driving execution in matrixed organizations, leading process improvement initiatives, and serving as the face of IT for business stakeholders at all levels. Experienced change agent who leads with problem-solving discipline across Agile, Waterfall, and iterative delivery frameworks — managing blended teams of vendor and FTE resources both onshore and offshore. PMP and CSM certified.</w:t>
+        <w:t>Progressive IT Delivery Leader with 15+ years of experience managing strategic programs and cross-functional technology teams in complex, matrixed environments. Proven track record of driving end-to-end software release delivery, managing vendor and FTE resources both onshore and offshore, and serving as a trusted senior technical advisor for business and technology stakeholders at all levels. Deep financial services background with hands-on experience across system architecture, application management, and full SDLC — spanning Agile, Waterfall, and iterative delivery methodologies. PMP and CSM certified with a consistent record of process improvement, on-time program delivery, and aligning technology execution with organizational priorities.</w:t>
       </w:r>
     </w:p>
     <w:p>
@@ -352,7 +352,7 @@
           <w:i/>
           <w:sz w:val="21"/>
         </w:rPr>
-        <w:t>Led successful delivery and execution of strategic IT programs ranging from $250K to $3M in a matrixed environment, coordinating 30+ application teams across onshore and offshore resources.</w:t>
+        <w:t>Led successful delivery of strategic IT programs ranging from $250K to $3M in a matrixed environment, coordinating 30+ application teams across onshore and offshore resources through all phases of the software release lifecycle.</w:t>
       </w:r>
     </w:p>
     <w:p>
@@ -367,7 +367,7 @@
           <w:i/>
           <w:sz w:val="21"/>
         </w:rPr>
-        <w:t>Served as the face of IT for business stakeholders at all levels, driving communications and alignment across enterprise technology and business units throughout all stages of the project lifecycle.</w:t>
+        <w:t>Served as the senior technical advisor and face of IT for business stakeholders at all levels, driving communications and alignment across enterprise technology and business units throughout all stages of the project lifecycle.</w:t>
       </w:r>
     </w:p>
     <w:p>
@@ -382,7 +382,37 @@
           <w:i/>
           <w:sz w:val="21"/>
         </w:rPr>
-        <w:t>Provided structure and leadership to blended project teams comprised of vendor and FTE resources both onshore and offshore, ensuring accountability and high-quality solution delivery.</w:t>
+        <w:t>Provided structure and leadership to blended project teams comprised of vendor and FTE resources both onshore and offshore, ensuring accountability and high-quality solution delivery across concurrent initiatives.</w:t>
+      </w:r>
+    </w:p>
+    <w:p>
+      <w:pPr>
+        <w:pStyle w:val="ListBullet"/>
+        <w:spacing w:after="0"/>
+      </w:pPr>
+      <w:r>
+        <w:rPr>
+          <w:rFonts w:ascii="Calibri" w:hAnsi="Calibri"/>
+          <w:b w:val="0"/>
+          <w:i/>
+          <w:sz w:val="21"/>
+        </w:rPr>
+        <w:t>Worked with the Release Management team to ensure all application teams were in alignment and ready for production deployment, coordinating cross-team readiness across each release cycle.</w:t>
+      </w:r>
+    </w:p>
+    <w:p>
+      <w:pPr>
+        <w:pStyle w:val="ListBullet"/>
+        <w:spacing w:after="0"/>
+      </w:pPr>
+      <w:r>
+        <w:rPr>
+          <w:rFonts w:ascii="Calibri" w:hAnsi="Calibri"/>
+          <w:b w:val="0"/>
+          <w:i/>
+          <w:sz w:val="21"/>
+        </w:rPr>
+        <w:t>Managed project proposals from concept through application impacts, estimates, project approval, and full enterprise lifecycle to production delivery — ensuring alignment with organizational standards and governance frameworks.</w:t>
       </w:r>
     </w:p>
     <w:p>
@@ -483,7 +513,7 @@
           <w:i/>
           <w:sz w:val="21"/>
         </w:rPr>
-        <w:t>Managed a 14-member team of business analysts and developers in a Financial Services matrixed environment, making hiring decisions that directly influenced team synergy and delivery performance.</w:t>
+        <w:t>Managed a 14-member team of business analysts and developers in a financial services matrixed environment, overseeing delivery across multiple lines of business and driving alignment between technology execution and strategic business priorities.</w:t>
       </w:r>
     </w:p>
     <w:p>
@@ -498,7 +528,7 @@
           <w:i/>
           <w:sz w:val="21"/>
         </w:rPr>
-        <w:t>Facilitated annual planning sessions with business partners and led cross-team delivery for projects ranging from $250K to $1.5M, acting as a change agent to align technology execution with strategic business priorities.</w:t>
+        <w:t>Delivered 36 releases to production in a single year, demonstrating high-volume software release discipline and operational rigor across multiple supported applications.</w:t>
       </w:r>
     </w:p>
     <w:p>
@@ -513,7 +543,7 @@
           <w:i/>
           <w:sz w:val="21"/>
         </w:rPr>
-        <w:t>Managed delivery teams using Agile, Waterfall, and iterative project methods, facilitating requirements sessions with business partners and test planning sessions with QA teams to drive high-quality outcomes.</w:t>
+        <w:t>Managed delivery teams using Agile, Waterfall, and iterative project methods, facilitating requirements and test planning sessions across multiple lines of business to ensure consistent and compliant delivery outcomes.</w:t>
       </w:r>
     </w:p>
     <w:p>

</xml_diff>